<commit_message>
Added cv for presentation
</commit_message>
<xml_diff>
--- a/cv/Eryk_Blaskowicz_CV.docx
+++ b/cv/Eryk_Blaskowicz_CV.docx
@@ -6,6 +6,7 @@
     <w:p>
       <w:r>
         <w:rPr>
+          <w:noProof/>
           <w:lang w:eastAsia="pl-PL"/>
         </w:rPr>
         <mc:AlternateContent>
@@ -87,6 +88,14 @@
                                 <w:szCs w:val="28"/>
                               </w:rPr>
                               <w:tab/>
+                            </w:r>
+                            <w:r>
+                              <w:rPr>
+                                <w:rFonts w:cs="Open Sans Light"/>
+                                <w:color w:val="FFFFFF" w:themeColor="background1"/>
+                                <w:sz w:val="28"/>
+                                <w:szCs w:val="28"/>
+                              </w:rPr>
                               <w:t xml:space="preserve"> </w:t>
                             </w:r>
                             <w:hyperlink r:id="rId8" w:history="1">
@@ -98,7 +107,7 @@
                                   <w:sz w:val="28"/>
                                   <w:szCs w:val="28"/>
                                 </w:rPr>
-                                <w:t>e.blaskowicz@gmail.pl</w:t>
+                                <w:t>blaskowiczeryk@gmail.pl</w:t>
                               </w:r>
                             </w:hyperlink>
                             <w:r>
@@ -185,6 +194,14 @@
                           <w:szCs w:val="28"/>
                         </w:rPr>
                         <w:tab/>
+                      </w:r>
+                      <w:r>
+                        <w:rPr>
+                          <w:rFonts w:cs="Open Sans Light"/>
+                          <w:color w:val="FFFFFF" w:themeColor="background1"/>
+                          <w:sz w:val="28"/>
+                          <w:szCs w:val="28"/>
+                        </w:rPr>
                         <w:t xml:space="preserve"> </w:t>
                       </w:r>
                       <w:hyperlink r:id="rId9" w:history="1">
@@ -196,7 +213,7 @@
                             <w:sz w:val="28"/>
                             <w:szCs w:val="28"/>
                           </w:rPr>
-                          <w:t>e.blaskowicz@gmail.pl</w:t>
+                          <w:t>blaskowiczeryk@gmail.pl</w:t>
                         </w:r>
                       </w:hyperlink>
                       <w:r>
@@ -230,6 +247,7 @@
       </w:r>
       <w:r>
         <w:rPr>
+          <w:noProof/>
           <w:lang w:eastAsia="pl-PL"/>
         </w:rPr>
         <mc:AlternateContent>
@@ -448,6 +466,7 @@
       </w:r>
       <w:r>
         <w:rPr>
+          <w:noProof/>
           <w:lang w:eastAsia="pl-PL"/>
         </w:rPr>
         <mc:AlternateContent>
@@ -527,6 +546,7 @@
       </w:r>
       <w:r>
         <w:rPr>
+          <w:noProof/>
           <w:lang w:eastAsia="pl-PL"/>
         </w:rPr>
         <mc:AlternateContent>
@@ -639,6 +659,7 @@
       </w:r>
       <w:r>
         <w:rPr>
+          <w:noProof/>
           <w:lang w:eastAsia="pl-PL"/>
         </w:rPr>
         <mc:AlternateContent>
@@ -739,6 +760,7 @@
       </w:r>
       <w:r>
         <w:rPr>
+          <w:noProof/>
           <w:lang w:eastAsia="pl-PL"/>
         </w:rPr>
         <mc:AlternateContent>
@@ -2556,6 +2578,7 @@
   <w:style w:type="character" w:default="1" w:styleId="Domylnaczcionkaakapitu">
     <w:name w:val="Default Paragraph Font"/>
     <w:uiPriority w:val="1"/>
+    <w:semiHidden/>
     <w:unhideWhenUsed/>
   </w:style>
   <w:style w:type="table" w:default="1" w:styleId="Standardowy">

</xml_diff>